<commit_message>
Fix .gitignore; track Phase 2 outputs, archive snapshots, and notebook figures
</commit_message>
<xml_diff>
--- a/paper/NE_Working_Draft_v19.docx
+++ b/paper/NE_Working_Draft_v19.docx
@@ -390,7 +390,39 @@
           <w:rFonts w:ascii="Times New Roman" w:hAnsi="Times New Roman" w:cs="Times New Roman"/>
           <w:bCs/>
         </w:rPr>
-        <w:t>. We test this condition empicially using 35,060 hours of day-ahead locational marginal pricing (DA LMP) data from January 2022 through December 2025, spanning five U.S. grid regions: PJM, ERCOT, CAISO, MISO, and NYISO. Within each region we identify destination pricing zones co-located with verified data center facilities using the Baxtel database and U.S. Department of Energy county-level data center inventory (ref. 11, 12). Stress hours are defined as hours in which the DA LMP exceeds the 99</w:t>
+        <w:t xml:space="preserve">. We test this condition </w:t>
+      </w:r>
+      <w:proofErr w:type="spellStart"/>
+      <w:r>
+        <w:rPr>
+          <w:rFonts w:ascii="Times New Roman" w:hAnsi="Times New Roman" w:cs="Times New Roman"/>
+          <w:bCs/>
+        </w:rPr>
+        <w:t>empicially</w:t>
+      </w:r>
+      <w:proofErr w:type="spellEnd"/>
+      <w:r>
+        <w:rPr>
+          <w:rFonts w:ascii="Times New Roman" w:hAnsi="Times New Roman" w:cs="Times New Roman"/>
+          <w:bCs/>
+        </w:rPr>
+        <w:t xml:space="preserve"> using 35,060 hours of day-ahead locational marginal pricing (DA LMP) data from January 2022 through December 2025, spanning five U.S. grid regions: PJM, ERCOT, CAISO, MISO, and NYISO. Within each region we identify destination pricing zones co-located with verified data center facilities using the </w:t>
+      </w:r>
+      <w:proofErr w:type="spellStart"/>
+      <w:r>
+        <w:rPr>
+          <w:rFonts w:ascii="Times New Roman" w:hAnsi="Times New Roman" w:cs="Times New Roman"/>
+          <w:bCs/>
+        </w:rPr>
+        <w:t>Baxtel</w:t>
+      </w:r>
+      <w:proofErr w:type="spellEnd"/>
+      <w:r>
+        <w:rPr>
+          <w:rFonts w:ascii="Times New Roman" w:hAnsi="Times New Roman" w:cs="Times New Roman"/>
+          <w:bCs/>
+        </w:rPr>
+        <w:t xml:space="preserve"> database and U.S. Department of Energy county-level data center inventory (ref. 11, 12). Stress hours are defined as hours in which the DA LMP exceeds the 99</w:t>
       </w:r>
       <w:r>
         <w:rPr>
@@ -566,22 +598,100 @@
           <w:bCs/>
         </w:rPr>
         <w:lastRenderedPageBreak/>
-        <w:t xml:space="preserve">time using two independent production inference datasets totaling 49.4 million requests over a combined 128 days of observation (see Mthods for dataset descriptions). P99 drain times range from 4.5 to 12.1 seconds across model configurations and datasets, approximately two orders of magnitude below PJM’s minimum dispatch window of 10 minutes (ref. 14), indicating that S3 = 0.90 is a conservative parameterization. The 10% excluded by S3 accomodates long-running or batched inference requests, multi-turn conversational session with persistent state, and potential future workload types with longer completion times (Fig. 4). </w:t>
-      </w:r>
-    </w:p>
-    <w:p>
-      <w:pPr>
-        <w:rPr>
-          <w:rFonts w:ascii="Times New Roman" w:hAnsi="Times New Roman" w:cs="Times New Roman"/>
-          <w:bCs/>
-        </w:rPr>
-      </w:pPr>
-      <w:r>
-        <w:rPr>
-          <w:rFonts w:ascii="Times New Roman" w:hAnsi="Times New Roman" w:cs="Times New Roman"/>
-          <w:bCs/>
-        </w:rPr>
-        <w:t>[FIGURE: Drain time cumulative distribution function, DynamoLLM vs. BurstGPT]</w:t>
+        <w:t xml:space="preserve">time using two independent production inference datasets totaling 49.4 million requests over a combined 128 days of observation (see </w:t>
+      </w:r>
+      <w:proofErr w:type="spellStart"/>
+      <w:r>
+        <w:rPr>
+          <w:rFonts w:ascii="Times New Roman" w:hAnsi="Times New Roman" w:cs="Times New Roman"/>
+          <w:bCs/>
+        </w:rPr>
+        <w:t>Mthods</w:t>
+      </w:r>
+      <w:proofErr w:type="spellEnd"/>
+      <w:r>
+        <w:rPr>
+          <w:rFonts w:ascii="Times New Roman" w:hAnsi="Times New Roman" w:cs="Times New Roman"/>
+          <w:bCs/>
+        </w:rPr>
+        <w:t xml:space="preserve"> for dataset descriptions). P99 drain times range from 4.5 to 12.1</w:t>
+      </w:r>
+      <w:r>
+        <w:rPr>
+          <w:rFonts w:ascii="Times New Roman" w:hAnsi="Times New Roman" w:cs="Times New Roman"/>
+          <w:bCs/>
+        </w:rPr>
+        <w:t>2</w:t>
+      </w:r>
+      <w:r>
+        <w:rPr>
+          <w:rFonts w:ascii="Times New Roman" w:hAnsi="Times New Roman" w:cs="Times New Roman"/>
+          <w:bCs/>
+        </w:rPr>
+        <w:t xml:space="preserve"> seconds across model configurations and datasets, approximately two orders of magnitude below PJM’s minimum dispatch window of 10 minutes (ref. 14), indicating that S3 = 0.90 is a conservative parameterization. The 10% excluded by S3 </w:t>
+      </w:r>
+      <w:proofErr w:type="spellStart"/>
+      <w:r>
+        <w:rPr>
+          <w:rFonts w:ascii="Times New Roman" w:hAnsi="Times New Roman" w:cs="Times New Roman"/>
+          <w:bCs/>
+        </w:rPr>
+        <w:t>accomodates</w:t>
+      </w:r>
+      <w:proofErr w:type="spellEnd"/>
+      <w:r>
+        <w:rPr>
+          <w:rFonts w:ascii="Times New Roman" w:hAnsi="Times New Roman" w:cs="Times New Roman"/>
+          <w:bCs/>
+        </w:rPr>
+        <w:t xml:space="preserve"> long-running or batched inference requests, multi-turn conversational session with persistent state, and potential future workload types with longer completion times (Fig. 4). </w:t>
+      </w:r>
+    </w:p>
+    <w:p>
+      <w:pPr>
+        <w:rPr>
+          <w:rFonts w:ascii="Times New Roman" w:hAnsi="Times New Roman" w:cs="Times New Roman"/>
+          <w:bCs/>
+        </w:rPr>
+      </w:pPr>
+      <w:r>
+        <w:rPr>
+          <w:rFonts w:ascii="Times New Roman" w:hAnsi="Times New Roman" w:cs="Times New Roman"/>
+          <w:bCs/>
+        </w:rPr>
+        <w:t xml:space="preserve">[FIGURE: Drain time cumulative distribution function, </w:t>
+      </w:r>
+      <w:proofErr w:type="spellStart"/>
+      <w:r>
+        <w:rPr>
+          <w:rFonts w:ascii="Times New Roman" w:hAnsi="Times New Roman" w:cs="Times New Roman"/>
+          <w:bCs/>
+        </w:rPr>
+        <w:t>DynamoLLM</w:t>
+      </w:r>
+      <w:proofErr w:type="spellEnd"/>
+      <w:r>
+        <w:rPr>
+          <w:rFonts w:ascii="Times New Roman" w:hAnsi="Times New Roman" w:cs="Times New Roman"/>
+          <w:bCs/>
+        </w:rPr>
+        <w:t xml:space="preserve"> vs. </w:t>
+      </w:r>
+      <w:proofErr w:type="spellStart"/>
+      <w:r>
+        <w:rPr>
+          <w:rFonts w:ascii="Times New Roman" w:hAnsi="Times New Roman" w:cs="Times New Roman"/>
+          <w:bCs/>
+        </w:rPr>
+        <w:t>BurstGPT</w:t>
+      </w:r>
+      <w:proofErr w:type="spellEnd"/>
+      <w:r>
+        <w:rPr>
+          <w:rFonts w:ascii="Times New Roman" w:hAnsi="Times New Roman" w:cs="Times New Roman"/>
+          <w:bCs/>
+        </w:rPr>
+        <w:t>]</w:t>
       </w:r>
     </w:p>
     <w:p>
@@ -872,7 +982,25 @@
           <w:bCs/>
           <w:highlight w:val="yellow"/>
         </w:rPr>
-        <w:t>e waiting period. An illustrative calculation using prevailing hyperscaler capital expenditure rates yields an interconnection acceleration value on the order of billions of dollars</w:t>
+        <w:t xml:space="preserve">e waiting period. An illustrative calculation using prevailing </w:t>
+      </w:r>
+      <w:proofErr w:type="spellStart"/>
+      <w:r>
+        <w:rPr>
+          <w:rFonts w:ascii="Times New Roman" w:hAnsi="Times New Roman" w:cs="Times New Roman"/>
+          <w:bCs/>
+          <w:highlight w:val="yellow"/>
+        </w:rPr>
+        <w:t>hyperscaler</w:t>
+      </w:r>
+      <w:proofErr w:type="spellEnd"/>
+      <w:r>
+        <w:rPr>
+          <w:rFonts w:ascii="Times New Roman" w:hAnsi="Times New Roman" w:cs="Times New Roman"/>
+          <w:bCs/>
+          <w:highlight w:val="yellow"/>
+        </w:rPr>
+        <w:t xml:space="preserve"> capital expenditure rates yields an interconnection acceleration value on the order of billions of dollars</w:t>
       </w:r>
       <w:r>
         <w:rPr>
@@ -1359,7 +1487,71 @@
           <w:rFonts w:ascii="Times New Roman" w:hAnsi="Times New Roman" w:cs="Times New Roman"/>
           <w:bCs/>
         </w:rPr>
-        <w:t xml:space="preserve"> Table M1 reports the central value, distribution, and empirical basis for each of the ten cascade parameters. Source-side parameters: S1 (workload candidacy) = 0.70, representing the inference-dominant share of facility compute load; S2 (data locality) = 0.70, Uniform[0.60, 0.95], bounded by regulatory analysis of data residency requirements; S3 (operational timing) = 0.90, validated empirically in Section 4. Destination-side parameters: D1 (cross-region availability) is observed per-hour from pricing data rather than drawn parametrically; D2 (utilization headroom) = 0.33, Uniform[0.20, 0.50], anchored on measured GPU utilization rates of 50-80% at hyperscaler AI inference facilities (refs. 26, 27), representing GPU compute absorption capacity rather than facility-level load factor (the latter includes cooling, networking, and storage overhead that cannot absorb migrated inference workloads); D3 (hardware compatibility) = 0.88, held fixed based on CUDA/TensorRT backward compatibility rates in published market data; D4 (inference workload share) = 0.50, Uniform[0.33, 0.67], bounded by industry projections of inference as a share of total data center compute (refs. 11, 12); D5 (pre-staging readiness) = 0.65, Uniform[0.50, 0.80], representing the weakest empirical layer in the decomposition, estimated from operational practice at hyperscaler-operated facilities. Execution parameters: E1 (routing completion) = 0.95; E2 (bandwidth adequacy) = 0.98. The commitment depth formula Commitment Depth = Spatial + DVFS × (S1 - Spatial) applies DVFS only to the compute-amenable portion of facility load, following Colangelo et al.'s measurement at the GPU cluster level via nvidia-smi (ref. 5).</w:t>
+        <w:t xml:space="preserve"> Table M1 reports the central value, distribution, and empirical basis for each of the ten cascade parameters. Source-side parameters: S1 (workload candidacy) = 0.70, representing the inference-dominant share of facility compute load; S2 (data locality) = 0.70, Uniform[0.60, 0.95], bounded by regulatory analysis of data residency requirements; S3 (operational timing) = 0.90, validated empirically in Section 4. Destination-side parameters: D1 (cross-region availability) is observed per-hour from pricing data rather than drawn parametrically; D2 (utilization headroom) = 0.33, Uniform[0.20, 0.50], anchored on measured GPU utilization rates of 50-80% at </w:t>
+      </w:r>
+      <w:proofErr w:type="spellStart"/>
+      <w:r>
+        <w:rPr>
+          <w:rFonts w:ascii="Times New Roman" w:hAnsi="Times New Roman" w:cs="Times New Roman"/>
+          <w:bCs/>
+        </w:rPr>
+        <w:t>hyperscaler</w:t>
+      </w:r>
+      <w:proofErr w:type="spellEnd"/>
+      <w:r>
+        <w:rPr>
+          <w:rFonts w:ascii="Times New Roman" w:hAnsi="Times New Roman" w:cs="Times New Roman"/>
+          <w:bCs/>
+        </w:rPr>
+        <w:t xml:space="preserve"> AI inference facilities (refs. 26, 27), representing GPU compute absorption capacity rather than facility-level load factor (the latter includes cooling, networking, and storage overhead that cannot absorb migrated inference workloads); D3 (hardware compatibility) = 0.88, held fixed based on CUDA/</w:t>
+      </w:r>
+      <w:proofErr w:type="spellStart"/>
+      <w:r>
+        <w:rPr>
+          <w:rFonts w:ascii="Times New Roman" w:hAnsi="Times New Roman" w:cs="Times New Roman"/>
+          <w:bCs/>
+        </w:rPr>
+        <w:t>TensorRT</w:t>
+      </w:r>
+      <w:proofErr w:type="spellEnd"/>
+      <w:r>
+        <w:rPr>
+          <w:rFonts w:ascii="Times New Roman" w:hAnsi="Times New Roman" w:cs="Times New Roman"/>
+          <w:bCs/>
+        </w:rPr>
+        <w:t xml:space="preserve"> backward compatibility rates in published market data; D4 (inference workload share) = 0.50, Uniform[0.33, 0.67], bounded by industry projections of inference as a share of total data center compute (refs. 11, 12); D5 (pre-staging readiness) = 0.65, Uniform[0.50, 0.80], representing the weakest empirical layer in the decomposition, estimated from operational practice at </w:t>
+      </w:r>
+      <w:proofErr w:type="spellStart"/>
+      <w:r>
+        <w:rPr>
+          <w:rFonts w:ascii="Times New Roman" w:hAnsi="Times New Roman" w:cs="Times New Roman"/>
+          <w:bCs/>
+        </w:rPr>
+        <w:t>hyperscaler</w:t>
+      </w:r>
+      <w:proofErr w:type="spellEnd"/>
+      <w:r>
+        <w:rPr>
+          <w:rFonts w:ascii="Times New Roman" w:hAnsi="Times New Roman" w:cs="Times New Roman"/>
+          <w:bCs/>
+        </w:rPr>
+        <w:t xml:space="preserve">-operated facilities. Execution parameters: E1 (routing completion) = 0.95; E2 (bandwidth adequacy) = 0.98. The commitment depth formula Commitment Depth = Spatial + DVFS × (S1 - Spatial) applies DVFS only to the compute-amenable portion of facility load, following Colangelo et al.'s measurement at the GPU cluster level via </w:t>
+      </w:r>
+      <w:proofErr w:type="spellStart"/>
+      <w:r>
+        <w:rPr>
+          <w:rFonts w:ascii="Times New Roman" w:hAnsi="Times New Roman" w:cs="Times New Roman"/>
+          <w:bCs/>
+        </w:rPr>
+        <w:t>nvidia-smi</w:t>
+      </w:r>
+      <w:proofErr w:type="spellEnd"/>
+      <w:r>
+        <w:rPr>
+          <w:rFonts w:ascii="Times New Roman" w:hAnsi="Times New Roman" w:cs="Times New Roman"/>
+          <w:bCs/>
+        </w:rPr>
+        <w:t xml:space="preserve"> (ref. 5).</w:t>
       </w:r>
     </w:p>
     <w:p>
@@ -1428,7 +1620,46 @@
           <w:rFonts w:ascii="Times New Roman" w:hAnsi="Times New Roman" w:cs="Times New Roman"/>
           <w:bCs/>
         </w:rPr>
-        <w:t xml:space="preserve"> The Microsoft Azure LLM Inference Dataset 2024 (DynamoLLM) comprises 44.1 million requests sampled from Azure production infrastructure over seven days in May 2024 (ref. 15). The BurstGPT dataset comprises 5.3 million requests from Azure OpenAI regional endpoints spanning 121 days of continuous observation (ref. 16). Both datasets represent production inference traffic. Drain times are computed at an assumed generation rate of 60 tokens per second; sensitivity to this assumption is reported in Extended Data Fig. 2. Diurnal </w:t>
+        <w:t xml:space="preserve"> </w:t>
+      </w:r>
+      <w:r>
+        <w:rPr>
+          <w:rFonts w:ascii="Times New Roman" w:hAnsi="Times New Roman" w:cs="Times New Roman"/>
+          <w:bCs/>
+        </w:rPr>
+        <w:t>The Microsoft Azure LLM Inference Dataset 2024 (</w:t>
+      </w:r>
+      <w:proofErr w:type="spellStart"/>
+      <w:r>
+        <w:rPr>
+          <w:rFonts w:ascii="Times New Roman" w:hAnsi="Times New Roman" w:cs="Times New Roman"/>
+          <w:bCs/>
+        </w:rPr>
+        <w:t>DynamoLLM</w:t>
+      </w:r>
+      <w:proofErr w:type="spellEnd"/>
+      <w:r>
+        <w:rPr>
+          <w:rFonts w:ascii="Times New Roman" w:hAnsi="Times New Roman" w:cs="Times New Roman"/>
+          <w:bCs/>
+        </w:rPr>
+        <w:t xml:space="preserve">) comprises 44.1 million requests sampled from Azure production infrastructure over seven days in May 2024 (ref. 15). The </w:t>
+      </w:r>
+      <w:proofErr w:type="spellStart"/>
+      <w:r>
+        <w:rPr>
+          <w:rFonts w:ascii="Times New Roman" w:hAnsi="Times New Roman" w:cs="Times New Roman"/>
+          <w:bCs/>
+        </w:rPr>
+        <w:t>BurstGPT</w:t>
+      </w:r>
+      <w:proofErr w:type="spellEnd"/>
+      <w:r>
+        <w:rPr>
+          <w:rFonts w:ascii="Times New Roman" w:hAnsi="Times New Roman" w:cs="Times New Roman"/>
+          <w:bCs/>
+        </w:rPr>
+        <w:t xml:space="preserve"> dataset comprises 5.3 million requests from Azure OpenAI regional endpoints spanning 121 days of continuous observation (ref. 16). Both datasets represent production inference traffic. Drain times are computed at an assumed generation rate of 60 tokens per second; sensitivity to this assumption is reported in Extended Data Fig. 2. Diurnal </w:t>
       </w:r>
       <w:r>
         <w:rPr>
@@ -1436,7 +1667,39 @@
           <w:bCs/>
         </w:rPr>
         <w:lastRenderedPageBreak/>
-        <w:t>usage patterns are confirmed in DynamoLLM (peak traffic approximately 2.5 times trough) but weaker in BurstGPT, likely reflecting different user populations. These temporal divergences do not affect the S3 parameterization, which depends on per-request drain time rather than aggregate traffic volume.</w:t>
+        <w:t xml:space="preserve">usage patterns in </w:t>
+      </w:r>
+      <w:proofErr w:type="spellStart"/>
+      <w:r>
+        <w:rPr>
+          <w:rFonts w:ascii="Times New Roman" w:hAnsi="Times New Roman" w:cs="Times New Roman"/>
+          <w:bCs/>
+        </w:rPr>
+        <w:t>DynamoLLM</w:t>
+      </w:r>
+      <w:proofErr w:type="spellEnd"/>
+      <w:r>
+        <w:rPr>
+          <w:rFonts w:ascii="Times New Roman" w:hAnsi="Times New Roman" w:cs="Times New Roman"/>
+          <w:bCs/>
+        </w:rPr>
+        <w:t xml:space="preserve"> range from approximately 3× peak-to-trough for conversational workloads to 35× for coding workloads (ref. 15), while </w:t>
+      </w:r>
+      <w:proofErr w:type="spellStart"/>
+      <w:r>
+        <w:rPr>
+          <w:rFonts w:ascii="Times New Roman" w:hAnsi="Times New Roman" w:cs="Times New Roman"/>
+          <w:bCs/>
+        </w:rPr>
+        <w:t>BurstGPT</w:t>
+      </w:r>
+      <w:proofErr w:type="spellEnd"/>
+      <w:r>
+        <w:rPr>
+          <w:rFonts w:ascii="Times New Roman" w:hAnsi="Times New Roman" w:cs="Times New Roman"/>
+          <w:bCs/>
+        </w:rPr>
+        <w:t xml:space="preserve"> exhibits near-continuous 24-hour activity with minimal weekly periodicity, consistent with differing user populations (Azure OpenAI regional API traffic vs. Azure internal production workloads). These temporal divergences do not affect the S3 parameterization, which depends on per-request drain time rather than aggregate traffic volume.</w:t>
       </w:r>
     </w:p>
     <w:p>
@@ -1505,7 +1768,23 @@
           <w:rFonts w:ascii="Times New Roman" w:hAnsi="Times New Roman" w:cs="Times New Roman"/>
           <w:bCs/>
         </w:rPr>
-        <w:t xml:space="preserve"> The fleet-level analysis evaluates commitment depth as a continuous function of fleet size from 0.5 to 20 GW. At each fleet size, the migrating demand in each stress hour is fleet_MW × S1 × S2 × S3 (the source-side cascade product). This demand competes for the same per-hour destination headroom computed in the conditional MC. The sweep identifies the contention onset (the fleet size at which more than 50% of draw-hour combinations become destination-constrained) and produces the commitment depth curve reported in Section 5.3.</w:t>
+        <w:t xml:space="preserve"> The fleet-level analysis evaluates commitment depth as a continuous function of fleet size from 0.5 to 20 GW. At each fleet size, the migrating demand in each stress hour is </w:t>
+      </w:r>
+      <w:proofErr w:type="spellStart"/>
+      <w:r>
+        <w:rPr>
+          <w:rFonts w:ascii="Times New Roman" w:hAnsi="Times New Roman" w:cs="Times New Roman"/>
+          <w:bCs/>
+        </w:rPr>
+        <w:t>fleet_MW</w:t>
+      </w:r>
+      <w:proofErr w:type="spellEnd"/>
+      <w:r>
+        <w:rPr>
+          <w:rFonts w:ascii="Times New Roman" w:hAnsi="Times New Roman" w:cs="Times New Roman"/>
+          <w:bCs/>
+        </w:rPr>
+        <w:t xml:space="preserve"> × S1 × S2 × S3 (the source-side cascade product). This demand competes for the same per-hour destination headroom computed in the conditional MC. The sweep identifies the contention onset (the fleet size at which more than 50% of draw-hour combinations become destination-constrained) and produces the commitment depth curve reported in Section 5.3.</w:t>
       </w:r>
     </w:p>
     <w:p>
@@ -1528,7 +1807,15 @@
           <w:rFonts w:ascii="Times New Roman" w:hAnsi="Times New Roman" w:cs="Times New Roman"/>
           <w:bCs/>
         </w:rPr>
-        <w:t xml:space="preserve"> The two-dimensional sensitivity surface evaluates fleet commitment depth (10 GW) across a 10 × 10 grid of D2 and D5 values, with D3 and D4 held at central values. Each grid point computes deterministic hour-by-hour commitment depth using the conditional MC framework. The tornado chart evaluates one-at-a-time sensitivity across all ten parameters at 10 GW, sweeping each from its lower to upper bound while holding others at central values.</w:t>
+        <w:t xml:space="preserve"> The two-dimensional sensitivity surface evaluates fleet commitment depth (10 GW) across a 10 × 10 grid of D2 and D5 values, with D3 and D4 held at central values. Each grid point computes deterministic hour-by-hour commitment depth using the conditional MC </w:t>
+      </w:r>
+      <w:r>
+        <w:rPr>
+          <w:rFonts w:ascii="Times New Roman" w:hAnsi="Times New Roman" w:cs="Times New Roman"/>
+          <w:bCs/>
+        </w:rPr>
+        <w:lastRenderedPageBreak/>
+        <w:t>framework. The tornado chart evaluates one-at-a-time sensitivity across all ten parameters at 10 GW, sweeping each from its lower to upper bound while holding others at central values.</w:t>
       </w:r>
     </w:p>
     <w:p>
@@ -1544,46 +1831,524 @@
           <w:b/>
           <w:bCs/>
         </w:rPr>
+        <w:t>System-level calculations.</w:t>
+      </w:r>
+      <w:r>
+        <w:rPr>
+          <w:rFonts w:ascii="Times New Roman" w:hAnsi="Times New Roman" w:cs="Times New Roman"/>
+          <w:bCs/>
+        </w:rPr>
+        <w:t xml:space="preserve"> The 92% ELCC applied to committed MW follows PJM precedent for demand response resources (ref. 29). Avoided capacity cost is computed using the E3 levelized CT cost of $180,000/MW-yr from the E3 2025 Resource Adequacy Study for Illinois (ref. 32). The interconnection acceleration calculation is reported in Extended Data with full assumptions and sensitivity.</w:t>
+      </w:r>
+    </w:p>
+    <w:p>
+      <w:pPr>
+        <w:rPr>
+          <w:rFonts w:ascii="Times New Roman" w:hAnsi="Times New Roman" w:cs="Times New Roman"/>
+          <w:bCs/>
+        </w:rPr>
+      </w:pPr>
+      <w:r>
+        <w:rPr>
+          <w:rFonts w:ascii="Times New Roman" w:hAnsi="Times New Roman" w:cs="Times New Roman"/>
+          <w:b/>
+          <w:bCs/>
+        </w:rPr>
+        <w:t>Data and Code Availability</w:t>
+      </w:r>
+    </w:p>
+    <w:p>
+      <w:pPr>
+        <w:rPr>
+          <w:rFonts w:ascii="Times New Roman" w:hAnsi="Times New Roman" w:cs="Times New Roman"/>
+          <w:bCs/>
+        </w:rPr>
+      </w:pPr>
+      <w:r>
+        <w:rPr>
+          <w:rFonts w:ascii="Times New Roman" w:hAnsi="Times New Roman" w:cs="Times New Roman"/>
+          <w:bCs/>
+        </w:rPr>
+        <w:t>Day-ahead LMP data are publicly available from PJM, ERCOT, CAISO, MISO,</w:t>
+      </w:r>
+      <w:r>
+        <w:rPr>
+          <w:rFonts w:ascii="Times New Roman" w:hAnsi="Times New Roman" w:cs="Times New Roman"/>
+          <w:bCs/>
+        </w:rPr>
+        <w:t xml:space="preserve"> </w:t>
+      </w:r>
+      <w:r>
+        <w:rPr>
+          <w:rFonts w:ascii="Times New Roman" w:hAnsi="Times New Roman" w:cs="Times New Roman"/>
+          <w:bCs/>
+        </w:rPr>
+        <w:t>and NYISO market portals. The Microsoft Azure LLM Inference Dataset 2024</w:t>
+      </w:r>
+      <w:r>
+        <w:rPr>
+          <w:rFonts w:ascii="Times New Roman" w:hAnsi="Times New Roman" w:cs="Times New Roman"/>
+          <w:bCs/>
+        </w:rPr>
+        <w:t xml:space="preserve"> </w:t>
+      </w:r>
+      <w:r>
+        <w:rPr>
+          <w:rFonts w:ascii="Times New Roman" w:hAnsi="Times New Roman" w:cs="Times New Roman"/>
+          <w:bCs/>
+        </w:rPr>
+        <w:t xml:space="preserve">is available at [repository]. The </w:t>
+      </w:r>
+      <w:proofErr w:type="spellStart"/>
+      <w:r>
+        <w:rPr>
+          <w:rFonts w:ascii="Times New Roman" w:hAnsi="Times New Roman" w:cs="Times New Roman"/>
+          <w:bCs/>
+        </w:rPr>
+        <w:t>BurstGPT</w:t>
+      </w:r>
+      <w:proofErr w:type="spellEnd"/>
+      <w:r>
+        <w:rPr>
+          <w:rFonts w:ascii="Times New Roman" w:hAnsi="Times New Roman" w:cs="Times New Roman"/>
+          <w:bCs/>
+        </w:rPr>
+        <w:t xml:space="preserve"> dataset is available at</w:t>
+      </w:r>
+      <w:r>
+        <w:rPr>
+          <w:rFonts w:ascii="Times New Roman" w:hAnsi="Times New Roman" w:cs="Times New Roman"/>
+          <w:bCs/>
+        </w:rPr>
+        <w:t xml:space="preserve"> </w:t>
+      </w:r>
+      <w:r>
+        <w:rPr>
+          <w:rFonts w:ascii="Times New Roman" w:hAnsi="Times New Roman" w:cs="Times New Roman"/>
+          <w:bCs/>
+        </w:rPr>
+        <w:t xml:space="preserve">[repository]. Data center location data are from </w:t>
+      </w:r>
+      <w:proofErr w:type="spellStart"/>
+      <w:r>
+        <w:rPr>
+          <w:rFonts w:ascii="Times New Roman" w:hAnsi="Times New Roman" w:cs="Times New Roman"/>
+          <w:bCs/>
+        </w:rPr>
+        <w:t>Baxtel</w:t>
+      </w:r>
+      <w:proofErr w:type="spellEnd"/>
+      <w:r>
+        <w:rPr>
+          <w:rFonts w:ascii="Times New Roman" w:hAnsi="Times New Roman" w:cs="Times New Roman"/>
+          <w:bCs/>
+        </w:rPr>
+        <w:t xml:space="preserve"> (baxtel.com</w:t>
+      </w:r>
+      <w:r>
+        <w:rPr>
+          <w:rFonts w:ascii="Times New Roman" w:hAnsi="Times New Roman" w:cs="Times New Roman"/>
+          <w:bCs/>
+        </w:rPr>
+        <w:t xml:space="preserve"> </w:t>
+      </w:r>
+      <w:r>
+        <w:rPr>
+          <w:rFonts w:ascii="Times New Roman" w:hAnsi="Times New Roman" w:cs="Times New Roman"/>
+          <w:bCs/>
+        </w:rPr>
+        <w:t>and the U.S. Department of Energy. Analysis code and processed datasets</w:t>
+      </w:r>
+      <w:r>
+        <w:rPr>
+          <w:rFonts w:ascii="Times New Roman" w:hAnsi="Times New Roman" w:cs="Times New Roman"/>
+          <w:bCs/>
+        </w:rPr>
+        <w:t xml:space="preserve"> </w:t>
+      </w:r>
+      <w:r>
+        <w:rPr>
+          <w:rFonts w:ascii="Times New Roman" w:hAnsi="Times New Roman" w:cs="Times New Roman"/>
+          <w:bCs/>
+        </w:rPr>
+        <w:t>will be made available upon publication.</w:t>
+      </w:r>
+    </w:p>
+    <w:p>
+      <w:pPr>
+        <w:rPr>
+          <w:rFonts w:ascii="Times New Roman" w:hAnsi="Times New Roman" w:cs="Times New Roman"/>
+          <w:bCs/>
+        </w:rPr>
+      </w:pPr>
+      <w:r>
+        <w:rPr>
+          <w:rFonts w:ascii="Times New Roman" w:hAnsi="Times New Roman" w:cs="Times New Roman"/>
+          <w:b/>
+          <w:bCs/>
+        </w:rPr>
+        <w:t>AI Disclosure</w:t>
+      </w:r>
+    </w:p>
+    <w:p>
+      <w:pPr>
+        <w:rPr>
+          <w:rFonts w:ascii="Times New Roman" w:hAnsi="Times New Roman" w:cs="Times New Roman"/>
+          <w:bCs/>
+        </w:rPr>
+      </w:pPr>
+      <w:r>
+        <w:rPr>
+          <w:rFonts w:ascii="Times New Roman" w:hAnsi="Times New Roman" w:cs="Times New Roman"/>
+          <w:bCs/>
+        </w:rPr>
+        <w:t>The author used AI tools (Anthropic Claude) to assist with structural</w:t>
+      </w:r>
+      <w:r>
+        <w:rPr>
+          <w:rFonts w:ascii="Times New Roman" w:hAnsi="Times New Roman" w:cs="Times New Roman"/>
+          <w:bCs/>
+        </w:rPr>
+        <w:t xml:space="preserve"> </w:t>
+      </w:r>
+      <w:r>
+        <w:rPr>
+          <w:rFonts w:ascii="Times New Roman" w:hAnsi="Times New Roman" w:cs="Times New Roman"/>
+          <w:bCs/>
+        </w:rPr>
+        <w:t>organization of the manuscript, literature search, and computational</w:t>
+      </w:r>
+      <w:r>
+        <w:rPr>
+          <w:rFonts w:ascii="Times New Roman" w:hAnsi="Times New Roman" w:cs="Times New Roman"/>
+          <w:bCs/>
+        </w:rPr>
+        <w:t xml:space="preserve"> </w:t>
+      </w:r>
+      <w:r>
+        <w:rPr>
+          <w:rFonts w:ascii="Times New Roman" w:hAnsi="Times New Roman" w:cs="Times New Roman"/>
+          <w:bCs/>
+        </w:rPr>
+        <w:t>code development. All analysis, interpretation, and text are the</w:t>
+      </w:r>
+      <w:r>
+        <w:rPr>
+          <w:rFonts w:ascii="Times New Roman" w:hAnsi="Times New Roman" w:cs="Times New Roman"/>
+          <w:bCs/>
+        </w:rPr>
+        <w:t xml:space="preserve"> </w:t>
+      </w:r>
+      <w:r>
+        <w:rPr>
+          <w:rFonts w:ascii="Times New Roman" w:hAnsi="Times New Roman" w:cs="Times New Roman"/>
+          <w:bCs/>
+        </w:rPr>
+        <w:t>author's own.</w:t>
+      </w:r>
+    </w:p>
+    <w:p>
+      <w:pPr>
+        <w:rPr>
+          <w:rFonts w:ascii="Times New Roman" w:hAnsi="Times New Roman" w:cs="Times New Roman"/>
+          <w:bCs/>
+        </w:rPr>
+      </w:pPr>
+      <w:r>
+        <w:rPr>
+          <w:rFonts w:ascii="Times New Roman" w:hAnsi="Times New Roman" w:cs="Times New Roman"/>
+          <w:b/>
+          <w:bCs/>
+        </w:rPr>
+        <w:t>Acknowledgments</w:t>
+      </w:r>
+    </w:p>
+    <w:p>
+      <w:pPr>
+        <w:rPr>
+          <w:rFonts w:ascii="Times New Roman" w:hAnsi="Times New Roman" w:cs="Times New Roman"/>
+          <w:bCs/>
+        </w:rPr>
+      </w:pPr>
+      <w:r>
+        <w:rPr>
+          <w:rFonts w:ascii="Times New Roman" w:hAnsi="Times New Roman" w:cs="Times New Roman"/>
+          <w:bCs/>
+        </w:rPr>
+        <w:t>The author thanks R. Rosner and the</w:t>
+      </w:r>
+      <w:r>
+        <w:rPr>
+          <w:rFonts w:ascii="Times New Roman" w:hAnsi="Times New Roman" w:cs="Times New Roman"/>
+          <w:bCs/>
+        </w:rPr>
+        <w:t xml:space="preserve"> </w:t>
+      </w:r>
+      <w:r>
+        <w:rPr>
+          <w:rFonts w:ascii="Times New Roman" w:hAnsi="Times New Roman" w:cs="Times New Roman"/>
+          <w:bCs/>
+        </w:rPr>
+        <w:t>Bartlett Fellowship in Energy Policy at the Energy Policy Institute at</w:t>
+      </w:r>
+      <w:r>
+        <w:rPr>
+          <w:rFonts w:ascii="Times New Roman" w:hAnsi="Times New Roman" w:cs="Times New Roman"/>
+          <w:bCs/>
+        </w:rPr>
+        <w:t xml:space="preserve"> </w:t>
+      </w:r>
+      <w:r>
+        <w:rPr>
+          <w:rFonts w:ascii="Times New Roman" w:hAnsi="Times New Roman" w:cs="Times New Roman"/>
+          <w:bCs/>
+        </w:rPr>
+        <w:t>Chicago.]</w:t>
+      </w:r>
+    </w:p>
+    <w:p>
+      <w:pPr>
+        <w:rPr>
+          <w:rFonts w:ascii="Times New Roman" w:hAnsi="Times New Roman" w:cs="Times New Roman"/>
+          <w:bCs/>
+        </w:rPr>
+      </w:pPr>
+    </w:p>
+    <w:p>
+      <w:pPr>
+        <w:rPr>
+          <w:rFonts w:ascii="Times New Roman" w:hAnsi="Times New Roman" w:cs="Times New Roman"/>
+          <w:bCs/>
+        </w:rPr>
+      </w:pPr>
+      <w:r>
+        <w:rPr>
+          <w:rFonts w:ascii="Times New Roman" w:hAnsi="Times New Roman" w:cs="Times New Roman"/>
+          <w:b/>
+          <w:bCs/>
+        </w:rPr>
+        <w:t>Selected References</w:t>
+      </w:r>
+    </w:p>
+    <w:p>
+      <w:pPr>
+        <w:rPr>
+          <w:rFonts w:ascii="Times New Roman" w:hAnsi="Times New Roman" w:cs="Times New Roman"/>
+          <w:bCs/>
+        </w:rPr>
+      </w:pPr>
+      <w:r>
+        <w:rPr>
+          <w:rFonts w:ascii="Times New Roman" w:hAnsi="Times New Roman" w:cs="Times New Roman"/>
+          <w:bCs/>
+        </w:rPr>
+        <w:t>[1] Colangelo, M. et al. Software-based power management for AI data</w:t>
+      </w:r>
+      <w:r>
+        <w:rPr>
+          <w:rFonts w:ascii="Times New Roman" w:hAnsi="Times New Roman" w:cs="Times New Roman"/>
+          <w:bCs/>
+        </w:rPr>
+        <w:t xml:space="preserve"> </w:t>
+      </w:r>
+      <w:r>
+        <w:rPr>
+          <w:rFonts w:ascii="Times New Roman" w:hAnsi="Times New Roman" w:cs="Times New Roman"/>
+          <w:bCs/>
+        </w:rPr>
+        <w:t>centers. Nature Energy (December 2025).</w:t>
+      </w:r>
+    </w:p>
+    <w:p>
+      <w:pPr>
+        <w:rPr>
+          <w:rFonts w:ascii="Times New Roman" w:hAnsi="Times New Roman" w:cs="Times New Roman"/>
+          <w:bCs/>
+        </w:rPr>
+      </w:pPr>
+      <w:r>
+        <w:rPr>
+          <w:rFonts w:ascii="Times New Roman" w:hAnsi="Times New Roman" w:cs="Times New Roman"/>
+          <w:bCs/>
+        </w:rPr>
+        <w:t>[2] PJM Interconnection. 2025 Long-Term Load Forecast (2025).</w:t>
+      </w:r>
+    </w:p>
+    <w:p>
+      <w:pPr>
+        <w:rPr>
+          <w:rFonts w:ascii="Times New Roman" w:hAnsi="Times New Roman" w:cs="Times New Roman"/>
+          <w:bCs/>
+        </w:rPr>
+      </w:pPr>
+      <w:r>
+        <w:rPr>
+          <w:rFonts w:ascii="Times New Roman" w:hAnsi="Times New Roman" w:cs="Times New Roman"/>
+          <w:bCs/>
+        </w:rPr>
+        <w:t>[3] PJM Interconnection. 2027/2028 Base Residual Auction Report</w:t>
+      </w:r>
+      <w:r>
+        <w:rPr>
+          <w:rFonts w:ascii="Times New Roman" w:hAnsi="Times New Roman" w:cs="Times New Roman"/>
+          <w:bCs/>
+        </w:rPr>
+        <w:t xml:space="preserve"> </w:t>
+      </w:r>
+      <w:r>
+        <w:rPr>
+          <w:rFonts w:ascii="Times New Roman" w:hAnsi="Times New Roman" w:cs="Times New Roman"/>
+          <w:bCs/>
+        </w:rPr>
+        <w:t>(2025).</w:t>
+      </w:r>
+    </w:p>
+    <w:p>
+      <w:pPr>
+        <w:rPr>
+          <w:rFonts w:ascii="Times New Roman" w:hAnsi="Times New Roman" w:cs="Times New Roman"/>
+          <w:bCs/>
+        </w:rPr>
+      </w:pPr>
+      <w:r>
+        <w:rPr>
+          <w:rFonts w:ascii="Times New Roman" w:hAnsi="Times New Roman" w:cs="Times New Roman"/>
+          <w:bCs/>
+        </w:rPr>
+        <w:t>[4] E3 (Energy + Environmental Economics). 2025 Resource Adequacy</w:t>
+      </w:r>
+      <w:r>
+        <w:rPr>
+          <w:rFonts w:ascii="Times New Roman" w:hAnsi="Times New Roman" w:cs="Times New Roman"/>
+          <w:bCs/>
+        </w:rPr>
+        <w:t xml:space="preserve"> </w:t>
+      </w:r>
+      <w:r>
+        <w:rPr>
+          <w:rFonts w:ascii="Times New Roman" w:hAnsi="Times New Roman" w:cs="Times New Roman"/>
+          <w:bCs/>
+        </w:rPr>
+        <w:t>Study for Illinois (2025).</w:t>
+      </w:r>
+    </w:p>
+    <w:p>
+      <w:pPr>
+        <w:rPr>
+          <w:rFonts w:ascii="Times New Roman" w:hAnsi="Times New Roman" w:cs="Times New Roman"/>
+          <w:bCs/>
+        </w:rPr>
+      </w:pPr>
+      <w:r>
+        <w:rPr>
+          <w:rFonts w:ascii="Times New Roman" w:hAnsi="Times New Roman" w:cs="Times New Roman"/>
+          <w:bCs/>
+        </w:rPr>
+        <w:t>[5] LBNL. Queued Up: Characteristics of Power Plants Seeking</w:t>
+      </w:r>
+      <w:r>
+        <w:rPr>
+          <w:rFonts w:ascii="Times New Roman" w:hAnsi="Times New Roman" w:cs="Times New Roman"/>
+          <w:bCs/>
+        </w:rPr>
+        <w:t xml:space="preserve"> </w:t>
+      </w:r>
+      <w:r>
+        <w:rPr>
+          <w:rFonts w:ascii="Times New Roman" w:hAnsi="Times New Roman" w:cs="Times New Roman"/>
+          <w:bCs/>
+        </w:rPr>
+        <w:t>Transmission Interconnection (2024).</w:t>
+      </w:r>
+    </w:p>
+    <w:p>
+      <w:pPr>
+        <w:rPr>
+          <w:rFonts w:ascii="Times New Roman" w:hAnsi="Times New Roman" w:cs="Times New Roman"/>
+          <w:bCs/>
+        </w:rPr>
+      </w:pPr>
+      <w:r>
+        <w:rPr>
+          <w:rFonts w:ascii="Times New Roman" w:hAnsi="Times New Roman" w:cs="Times New Roman"/>
+          <w:bCs/>
+        </w:rPr>
+        <w:t>[6] NREL. 2024 Annual Technology Baseline.</w:t>
+      </w:r>
+      <w:r>
+        <w:rPr>
+          <w:rFonts w:ascii="Times New Roman" w:hAnsi="Times New Roman" w:cs="Times New Roman"/>
+          <w:bCs/>
+        </w:rPr>
+        <w:t xml:space="preserve"> </w:t>
+      </w:r>
+      <w:r>
+        <w:rPr>
+          <w:rFonts w:ascii="Times New Roman" w:hAnsi="Times New Roman" w:cs="Times New Roman"/>
+          <w:bCs/>
+        </w:rPr>
+        <w:t>atb.nrel.gov/electricity/2024.</w:t>
+      </w:r>
+    </w:p>
+    <w:p>
+      <w:pPr>
+        <w:rPr>
+          <w:rFonts w:ascii="Times New Roman" w:hAnsi="Times New Roman" w:cs="Times New Roman"/>
+          <w:bCs/>
+        </w:rPr>
+      </w:pPr>
+      <w:r>
+        <w:rPr>
+          <w:rFonts w:ascii="Times New Roman" w:hAnsi="Times New Roman" w:cs="Times New Roman"/>
+          <w:bCs/>
+        </w:rPr>
+        <w:t>[7] FERC. Order on Transmission Service for Co-Located Load. 193 FERC</w:t>
+      </w:r>
+      <w:r>
+        <w:rPr>
+          <w:rFonts w:ascii="Times New Roman" w:hAnsi="Times New Roman" w:cs="Times New Roman"/>
+          <w:bCs/>
+        </w:rPr>
+        <w:t xml:space="preserve"> </w:t>
+      </w:r>
+      <w:r>
+        <w:rPr>
+          <w:rFonts w:ascii="Times New Roman" w:hAnsi="Times New Roman" w:cs="Times New Roman"/>
+          <w:bCs/>
+        </w:rPr>
+        <w:t>¶ 61,217, Docket Nos. EL25-49-000 et al. (December 18, 2025).</w:t>
+      </w:r>
+    </w:p>
+    <w:p>
+      <w:pPr>
+        <w:rPr>
+          <w:rFonts w:ascii="Times New Roman" w:hAnsi="Times New Roman" w:cs="Times New Roman"/>
+          <w:bCs/>
+        </w:rPr>
+      </w:pPr>
+      <w:r>
+        <w:rPr>
+          <w:rFonts w:ascii="Times New Roman" w:hAnsi="Times New Roman" w:cs="Times New Roman"/>
+          <w:bCs/>
+        </w:rPr>
         <w:lastRenderedPageBreak/>
-        <w:t>System-level calculations.</w:t>
-      </w:r>
-      <w:r>
-        <w:rPr>
-          <w:rFonts w:ascii="Times New Roman" w:hAnsi="Times New Roman" w:cs="Times New Roman"/>
-          <w:bCs/>
-        </w:rPr>
-        <w:t xml:space="preserve"> The 92% ELCC applied to committed MW follows PJM precedent for demand response resources (ref. 29). Avoided capacity cost is computed using the E3 levelized CT cost of $180,000/MW-yr from the E3 2025 Resource Adequacy Study for Illinois (ref. 32). The interconnection acceleration calculation is reported in Extended Data with full assumptions and sensitivity.</w:t>
-      </w:r>
-    </w:p>
-    <w:p>
-      <w:pPr>
-        <w:rPr>
-          <w:rFonts w:ascii="Times New Roman" w:hAnsi="Times New Roman" w:cs="Times New Roman"/>
-          <w:bCs/>
-        </w:rPr>
-      </w:pPr>
-      <w:r>
-        <w:rPr>
-          <w:rFonts w:ascii="Times New Roman" w:hAnsi="Times New Roman" w:cs="Times New Roman"/>
-          <w:b/>
-          <w:bCs/>
-        </w:rPr>
-        <w:t>Data and Code Availability</w:t>
-      </w:r>
-    </w:p>
-    <w:p>
-      <w:pPr>
-        <w:rPr>
-          <w:rFonts w:ascii="Times New Roman" w:hAnsi="Times New Roman" w:cs="Times New Roman"/>
-          <w:bCs/>
-        </w:rPr>
-      </w:pPr>
-      <w:r>
-        <w:rPr>
-          <w:rFonts w:ascii="Times New Roman" w:hAnsi="Times New Roman" w:cs="Times New Roman"/>
-          <w:bCs/>
-        </w:rPr>
-        <w:t>Day-ahead LMP data are publicly available from PJM, ERCOT, CAISO, MISO,</w:t>
+        <w:t xml:space="preserve">[8] Patel, P. et al. </w:t>
+      </w:r>
+      <w:proofErr w:type="spellStart"/>
+      <w:r>
+        <w:rPr>
+          <w:rFonts w:ascii="Times New Roman" w:hAnsi="Times New Roman" w:cs="Times New Roman"/>
+          <w:bCs/>
+        </w:rPr>
+        <w:t>Splitwise</w:t>
+      </w:r>
+      <w:proofErr w:type="spellEnd"/>
+      <w:r>
+        <w:rPr>
+          <w:rFonts w:ascii="Times New Roman" w:hAnsi="Times New Roman" w:cs="Times New Roman"/>
+          <w:bCs/>
+        </w:rPr>
+        <w:t>: Efficient generative LLM inference</w:t>
       </w:r>
       <w:r>
         <w:rPr>
@@ -1597,7 +2362,38 @@
           <w:rFonts w:ascii="Times New Roman" w:hAnsi="Times New Roman" w:cs="Times New Roman"/>
           <w:bCs/>
         </w:rPr>
-        <w:t>and NYISO market portals. The Microsoft Azure LLM Inference Dataset 2024</w:t>
+        <w:t>using phase splitting. ISCA (2024).</w:t>
+      </w:r>
+    </w:p>
+    <w:p>
+      <w:pPr>
+        <w:rPr>
+          <w:rFonts w:ascii="Times New Roman" w:hAnsi="Times New Roman" w:cs="Times New Roman"/>
+          <w:bCs/>
+        </w:rPr>
+      </w:pPr>
+      <w:r>
+        <w:rPr>
+          <w:rFonts w:ascii="Times New Roman" w:hAnsi="Times New Roman" w:cs="Times New Roman"/>
+          <w:bCs/>
+        </w:rPr>
+        <w:t xml:space="preserve">[9] Stojkovic, J. et al. </w:t>
+      </w:r>
+      <w:proofErr w:type="spellStart"/>
+      <w:r>
+        <w:rPr>
+          <w:rFonts w:ascii="Times New Roman" w:hAnsi="Times New Roman" w:cs="Times New Roman"/>
+          <w:bCs/>
+        </w:rPr>
+        <w:t>DynamoLLM</w:t>
+      </w:r>
+      <w:proofErr w:type="spellEnd"/>
+      <w:r>
+        <w:rPr>
+          <w:rFonts w:ascii="Times New Roman" w:hAnsi="Times New Roman" w:cs="Times New Roman"/>
+          <w:bCs/>
+        </w:rPr>
+        <w:t>: Designing LLM inference clusters</w:t>
       </w:r>
       <w:r>
         <w:rPr>
@@ -1611,7 +2407,38 @@
           <w:rFonts w:ascii="Times New Roman" w:hAnsi="Times New Roman" w:cs="Times New Roman"/>
           <w:bCs/>
         </w:rPr>
-        <w:t>is available at [repository]. The BurstGPT dataset is available at</w:t>
+        <w:t>for performance and energy efficiency. arXiv:2408.00741 (2024).</w:t>
+      </w:r>
+    </w:p>
+    <w:p>
+      <w:pPr>
+        <w:rPr>
+          <w:rFonts w:ascii="Times New Roman" w:hAnsi="Times New Roman" w:cs="Times New Roman"/>
+          <w:bCs/>
+        </w:rPr>
+      </w:pPr>
+      <w:r>
+        <w:rPr>
+          <w:rFonts w:ascii="Times New Roman" w:hAnsi="Times New Roman" w:cs="Times New Roman"/>
+          <w:bCs/>
+        </w:rPr>
+        <w:t xml:space="preserve">[10] Wang, Y. et al. </w:t>
+      </w:r>
+      <w:proofErr w:type="spellStart"/>
+      <w:r>
+        <w:rPr>
+          <w:rFonts w:ascii="Times New Roman" w:hAnsi="Times New Roman" w:cs="Times New Roman"/>
+          <w:bCs/>
+        </w:rPr>
+        <w:t>BurstGPT</w:t>
+      </w:r>
+      <w:proofErr w:type="spellEnd"/>
+      <w:r>
+        <w:rPr>
+          <w:rFonts w:ascii="Times New Roman" w:hAnsi="Times New Roman" w:cs="Times New Roman"/>
+          <w:bCs/>
+        </w:rPr>
+        <w:t>: A real-world workload dataset for large</w:t>
       </w:r>
       <w:r>
         <w:rPr>
@@ -1625,468 +2452,23 @@
           <w:rFonts w:ascii="Times New Roman" w:hAnsi="Times New Roman" w:cs="Times New Roman"/>
           <w:bCs/>
         </w:rPr>
-        <w:t>[repository]. Data center location data are from Baxtel (baxtel.com</w:t>
-      </w:r>
-      <w:r>
-        <w:rPr>
-          <w:rFonts w:ascii="Times New Roman" w:hAnsi="Times New Roman" w:cs="Times New Roman"/>
-          <w:bCs/>
-        </w:rPr>
-        <w:t xml:space="preserve"> </w:t>
-      </w:r>
-      <w:r>
-        <w:rPr>
-          <w:rFonts w:ascii="Times New Roman" w:hAnsi="Times New Roman" w:cs="Times New Roman"/>
-          <w:bCs/>
-        </w:rPr>
-        <w:t>and the U.S. Department of Energy. Analysis code and processed datasets</w:t>
-      </w:r>
-      <w:r>
-        <w:rPr>
-          <w:rFonts w:ascii="Times New Roman" w:hAnsi="Times New Roman" w:cs="Times New Roman"/>
-          <w:bCs/>
-        </w:rPr>
-        <w:t xml:space="preserve"> </w:t>
-      </w:r>
-      <w:r>
-        <w:rPr>
-          <w:rFonts w:ascii="Times New Roman" w:hAnsi="Times New Roman" w:cs="Times New Roman"/>
-          <w:bCs/>
-        </w:rPr>
-        <w:t>will be made available upon publication.</w:t>
-      </w:r>
-    </w:p>
-    <w:p>
-      <w:pPr>
-        <w:rPr>
-          <w:rFonts w:ascii="Times New Roman" w:hAnsi="Times New Roman" w:cs="Times New Roman"/>
-          <w:bCs/>
-        </w:rPr>
-      </w:pPr>
-      <w:r>
-        <w:rPr>
-          <w:rFonts w:ascii="Times New Roman" w:hAnsi="Times New Roman" w:cs="Times New Roman"/>
-          <w:b/>
-          <w:bCs/>
-        </w:rPr>
-        <w:t>AI Disclosure</w:t>
-      </w:r>
-    </w:p>
-    <w:p>
-      <w:pPr>
-        <w:rPr>
-          <w:rFonts w:ascii="Times New Roman" w:hAnsi="Times New Roman" w:cs="Times New Roman"/>
-          <w:bCs/>
-        </w:rPr>
-      </w:pPr>
-      <w:r>
-        <w:rPr>
-          <w:rFonts w:ascii="Times New Roman" w:hAnsi="Times New Roman" w:cs="Times New Roman"/>
-          <w:bCs/>
-        </w:rPr>
-        <w:t>The author used AI tools (Anthropic Claude) to assist with structural</w:t>
-      </w:r>
-      <w:r>
-        <w:rPr>
-          <w:rFonts w:ascii="Times New Roman" w:hAnsi="Times New Roman" w:cs="Times New Roman"/>
-          <w:bCs/>
-        </w:rPr>
-        <w:t xml:space="preserve"> </w:t>
-      </w:r>
-      <w:r>
-        <w:rPr>
-          <w:rFonts w:ascii="Times New Roman" w:hAnsi="Times New Roman" w:cs="Times New Roman"/>
-          <w:bCs/>
-        </w:rPr>
-        <w:t>organization of the manuscript, literature search, and computational</w:t>
-      </w:r>
-      <w:r>
-        <w:rPr>
-          <w:rFonts w:ascii="Times New Roman" w:hAnsi="Times New Roman" w:cs="Times New Roman"/>
-          <w:bCs/>
-        </w:rPr>
-        <w:t xml:space="preserve"> </w:t>
-      </w:r>
-      <w:r>
-        <w:rPr>
-          <w:rFonts w:ascii="Times New Roman" w:hAnsi="Times New Roman" w:cs="Times New Roman"/>
-          <w:bCs/>
-        </w:rPr>
-        <w:t>code development. All analysis, interpretation, and text are the</w:t>
-      </w:r>
-      <w:r>
-        <w:rPr>
-          <w:rFonts w:ascii="Times New Roman" w:hAnsi="Times New Roman" w:cs="Times New Roman"/>
-          <w:bCs/>
-        </w:rPr>
-        <w:t xml:space="preserve"> </w:t>
-      </w:r>
-      <w:r>
-        <w:rPr>
-          <w:rFonts w:ascii="Times New Roman" w:hAnsi="Times New Roman" w:cs="Times New Roman"/>
-          <w:bCs/>
-        </w:rPr>
-        <w:t>author's own.</w:t>
-      </w:r>
-    </w:p>
-    <w:p>
-      <w:pPr>
-        <w:rPr>
-          <w:rFonts w:ascii="Times New Roman" w:hAnsi="Times New Roman" w:cs="Times New Roman"/>
-          <w:bCs/>
-        </w:rPr>
-      </w:pPr>
-      <w:r>
-        <w:rPr>
-          <w:rFonts w:ascii="Times New Roman" w:hAnsi="Times New Roman" w:cs="Times New Roman"/>
-          <w:b/>
-          <w:bCs/>
-        </w:rPr>
-        <w:t>Acknowledgments</w:t>
-      </w:r>
-    </w:p>
-    <w:p>
-      <w:pPr>
-        <w:rPr>
-          <w:rFonts w:ascii="Times New Roman" w:hAnsi="Times New Roman" w:cs="Times New Roman"/>
-          <w:bCs/>
-        </w:rPr>
-      </w:pPr>
-      <w:r>
-        <w:rPr>
-          <w:rFonts w:ascii="Times New Roman" w:hAnsi="Times New Roman" w:cs="Times New Roman"/>
-          <w:bCs/>
-        </w:rPr>
-        <w:t>The author thanks R. Rosner and the</w:t>
-      </w:r>
-      <w:r>
-        <w:rPr>
-          <w:rFonts w:ascii="Times New Roman" w:hAnsi="Times New Roman" w:cs="Times New Roman"/>
-          <w:bCs/>
-        </w:rPr>
-        <w:t xml:space="preserve"> </w:t>
-      </w:r>
-      <w:r>
-        <w:rPr>
-          <w:rFonts w:ascii="Times New Roman" w:hAnsi="Times New Roman" w:cs="Times New Roman"/>
-          <w:bCs/>
-        </w:rPr>
-        <w:t>Bartlett Fellowship in Energy Policy at the Energy Policy Institute at</w:t>
-      </w:r>
-      <w:r>
-        <w:rPr>
-          <w:rFonts w:ascii="Times New Roman" w:hAnsi="Times New Roman" w:cs="Times New Roman"/>
-          <w:bCs/>
-        </w:rPr>
-        <w:t xml:space="preserve"> </w:t>
-      </w:r>
-      <w:r>
-        <w:rPr>
-          <w:rFonts w:ascii="Times New Roman" w:hAnsi="Times New Roman" w:cs="Times New Roman"/>
-          <w:bCs/>
-        </w:rPr>
-        <w:t>Chicago.]</w:t>
-      </w:r>
-    </w:p>
-    <w:p>
-      <w:pPr>
-        <w:rPr>
-          <w:rFonts w:ascii="Times New Roman" w:hAnsi="Times New Roman" w:cs="Times New Roman"/>
-          <w:bCs/>
-        </w:rPr>
-      </w:pPr>
-    </w:p>
-    <w:p>
-      <w:pPr>
-        <w:rPr>
-          <w:rFonts w:ascii="Times New Roman" w:hAnsi="Times New Roman" w:cs="Times New Roman"/>
-          <w:bCs/>
-        </w:rPr>
-      </w:pPr>
-      <w:r>
-        <w:rPr>
-          <w:rFonts w:ascii="Times New Roman" w:hAnsi="Times New Roman" w:cs="Times New Roman"/>
-          <w:b/>
-          <w:bCs/>
-        </w:rPr>
-        <w:t>Selected References</w:t>
-      </w:r>
-    </w:p>
-    <w:p>
-      <w:pPr>
-        <w:rPr>
-          <w:rFonts w:ascii="Times New Roman" w:hAnsi="Times New Roman" w:cs="Times New Roman"/>
-          <w:bCs/>
-        </w:rPr>
-      </w:pPr>
-      <w:r>
-        <w:rPr>
-          <w:rFonts w:ascii="Times New Roman" w:hAnsi="Times New Roman" w:cs="Times New Roman"/>
-          <w:bCs/>
-        </w:rPr>
-        <w:t>[1] Colangelo, M. et al. Software-based power management for AI data</w:t>
-      </w:r>
-      <w:r>
-        <w:rPr>
-          <w:rFonts w:ascii="Times New Roman" w:hAnsi="Times New Roman" w:cs="Times New Roman"/>
-          <w:bCs/>
-        </w:rPr>
-        <w:t xml:space="preserve"> </w:t>
-      </w:r>
-      <w:r>
-        <w:rPr>
-          <w:rFonts w:ascii="Times New Roman" w:hAnsi="Times New Roman" w:cs="Times New Roman"/>
-          <w:bCs/>
-        </w:rPr>
-        <w:t>centers. Nature Energy (December 2025).</w:t>
-      </w:r>
-    </w:p>
-    <w:p>
-      <w:pPr>
-        <w:rPr>
-          <w:rFonts w:ascii="Times New Roman" w:hAnsi="Times New Roman" w:cs="Times New Roman"/>
-          <w:bCs/>
-        </w:rPr>
-      </w:pPr>
-      <w:r>
-        <w:rPr>
-          <w:rFonts w:ascii="Times New Roman" w:hAnsi="Times New Roman" w:cs="Times New Roman"/>
-          <w:bCs/>
-        </w:rPr>
-        <w:t>[2] PJM Interconnection. 2025 Long-Term Load Forecast (2025).</w:t>
-      </w:r>
-    </w:p>
-    <w:p>
-      <w:pPr>
-        <w:rPr>
-          <w:rFonts w:ascii="Times New Roman" w:hAnsi="Times New Roman" w:cs="Times New Roman"/>
-          <w:bCs/>
-        </w:rPr>
-      </w:pPr>
-      <w:r>
-        <w:rPr>
-          <w:rFonts w:ascii="Times New Roman" w:hAnsi="Times New Roman" w:cs="Times New Roman"/>
-          <w:bCs/>
-        </w:rPr>
-        <w:t>[3] PJM Interconnection. 2027/2028 Base Residual Auction Report</w:t>
-      </w:r>
-      <w:r>
-        <w:rPr>
-          <w:rFonts w:ascii="Times New Roman" w:hAnsi="Times New Roman" w:cs="Times New Roman"/>
-          <w:bCs/>
-        </w:rPr>
-        <w:t xml:space="preserve"> </w:t>
-      </w:r>
-      <w:r>
-        <w:rPr>
-          <w:rFonts w:ascii="Times New Roman" w:hAnsi="Times New Roman" w:cs="Times New Roman"/>
-          <w:bCs/>
-        </w:rPr>
-        <w:t>(2025).</w:t>
-      </w:r>
-    </w:p>
-    <w:p>
-      <w:pPr>
-        <w:rPr>
-          <w:rFonts w:ascii="Times New Roman" w:hAnsi="Times New Roman" w:cs="Times New Roman"/>
-          <w:bCs/>
-        </w:rPr>
-      </w:pPr>
-      <w:r>
-        <w:rPr>
-          <w:rFonts w:ascii="Times New Roman" w:hAnsi="Times New Roman" w:cs="Times New Roman"/>
-          <w:bCs/>
-        </w:rPr>
-        <w:t>[4] E3 (Energy + Environmental Economics). 2025 Resource Adequacy</w:t>
-      </w:r>
-      <w:r>
-        <w:rPr>
-          <w:rFonts w:ascii="Times New Roman" w:hAnsi="Times New Roman" w:cs="Times New Roman"/>
-          <w:bCs/>
-        </w:rPr>
-        <w:t xml:space="preserve"> </w:t>
-      </w:r>
-      <w:r>
-        <w:rPr>
-          <w:rFonts w:ascii="Times New Roman" w:hAnsi="Times New Roman" w:cs="Times New Roman"/>
-          <w:bCs/>
-        </w:rPr>
-        <w:t>Study for Illinois (2025).</w:t>
-      </w:r>
-    </w:p>
-    <w:p>
-      <w:pPr>
-        <w:rPr>
-          <w:rFonts w:ascii="Times New Roman" w:hAnsi="Times New Roman" w:cs="Times New Roman"/>
-          <w:bCs/>
-        </w:rPr>
-      </w:pPr>
-      <w:r>
-        <w:rPr>
-          <w:rFonts w:ascii="Times New Roman" w:hAnsi="Times New Roman" w:cs="Times New Roman"/>
-          <w:bCs/>
-        </w:rPr>
-        <w:t>[5] LBNL. Queued Up: Characteristics of Power Plants Seeking</w:t>
-      </w:r>
-      <w:r>
-        <w:rPr>
-          <w:rFonts w:ascii="Times New Roman" w:hAnsi="Times New Roman" w:cs="Times New Roman"/>
-          <w:bCs/>
-        </w:rPr>
-        <w:t xml:space="preserve"> </w:t>
-      </w:r>
-      <w:r>
-        <w:rPr>
-          <w:rFonts w:ascii="Times New Roman" w:hAnsi="Times New Roman" w:cs="Times New Roman"/>
-          <w:bCs/>
-        </w:rPr>
-        <w:t>Transmission Interconnection (2024).</w:t>
-      </w:r>
-    </w:p>
-    <w:p>
-      <w:pPr>
-        <w:rPr>
-          <w:rFonts w:ascii="Times New Roman" w:hAnsi="Times New Roman" w:cs="Times New Roman"/>
-          <w:bCs/>
-        </w:rPr>
-      </w:pPr>
-      <w:r>
-        <w:rPr>
-          <w:rFonts w:ascii="Times New Roman" w:hAnsi="Times New Roman" w:cs="Times New Roman"/>
-          <w:bCs/>
-        </w:rPr>
-        <w:t>[6] NREL. 2024 Annual Technology Baseline.</w:t>
-      </w:r>
-      <w:r>
-        <w:rPr>
-          <w:rFonts w:ascii="Times New Roman" w:hAnsi="Times New Roman" w:cs="Times New Roman"/>
-          <w:bCs/>
-        </w:rPr>
-        <w:t xml:space="preserve"> </w:t>
-      </w:r>
-      <w:r>
-        <w:rPr>
-          <w:rFonts w:ascii="Times New Roman" w:hAnsi="Times New Roman" w:cs="Times New Roman"/>
-          <w:bCs/>
-        </w:rPr>
-        <w:t>atb.nrel.gov/electricity/2024.</w:t>
-      </w:r>
-    </w:p>
-    <w:p>
-      <w:pPr>
-        <w:rPr>
-          <w:rFonts w:ascii="Times New Roman" w:hAnsi="Times New Roman" w:cs="Times New Roman"/>
-          <w:bCs/>
-        </w:rPr>
-      </w:pPr>
-      <w:r>
-        <w:rPr>
-          <w:rFonts w:ascii="Times New Roman" w:hAnsi="Times New Roman" w:cs="Times New Roman"/>
-          <w:bCs/>
-        </w:rPr>
-        <w:t>[7] FERC. Order on Transmission Service for Co-Located Load. 193 FERC</w:t>
-      </w:r>
-      <w:r>
-        <w:rPr>
-          <w:rFonts w:ascii="Times New Roman" w:hAnsi="Times New Roman" w:cs="Times New Roman"/>
-          <w:bCs/>
-        </w:rPr>
-        <w:t xml:space="preserve"> </w:t>
-      </w:r>
-      <w:r>
-        <w:rPr>
-          <w:rFonts w:ascii="Times New Roman" w:hAnsi="Times New Roman" w:cs="Times New Roman"/>
-          <w:bCs/>
-        </w:rPr>
-        <w:t>¶ 61,217, Docket Nos. EL25-49-000 et al. (December 18, 2025).</w:t>
-      </w:r>
-    </w:p>
-    <w:p>
-      <w:pPr>
-        <w:rPr>
-          <w:rFonts w:ascii="Times New Roman" w:hAnsi="Times New Roman" w:cs="Times New Roman"/>
-          <w:bCs/>
-        </w:rPr>
-      </w:pPr>
-      <w:r>
-        <w:rPr>
-          <w:rFonts w:ascii="Times New Roman" w:hAnsi="Times New Roman" w:cs="Times New Roman"/>
-          <w:bCs/>
-        </w:rPr>
-        <w:t>[8] Patel, P. et al. Splitwise: Efficient generative LLM inference</w:t>
-      </w:r>
-      <w:r>
-        <w:rPr>
-          <w:rFonts w:ascii="Times New Roman" w:hAnsi="Times New Roman" w:cs="Times New Roman"/>
-          <w:bCs/>
-        </w:rPr>
-        <w:t xml:space="preserve"> </w:t>
-      </w:r>
-      <w:r>
-        <w:rPr>
-          <w:rFonts w:ascii="Times New Roman" w:hAnsi="Times New Roman" w:cs="Times New Roman"/>
-          <w:bCs/>
-        </w:rPr>
-        <w:t>using phase splitting. ISCA (2024).</w:t>
-      </w:r>
-    </w:p>
-    <w:p>
-      <w:pPr>
-        <w:rPr>
-          <w:rFonts w:ascii="Times New Roman" w:hAnsi="Times New Roman" w:cs="Times New Roman"/>
-          <w:bCs/>
-        </w:rPr>
-      </w:pPr>
-      <w:r>
-        <w:rPr>
-          <w:rFonts w:ascii="Times New Roman" w:hAnsi="Times New Roman" w:cs="Times New Roman"/>
-          <w:bCs/>
-        </w:rPr>
-        <w:lastRenderedPageBreak/>
-        <w:t>[9] Stojkovic, J. et al. DynamoLLM: Designing LLM inference clusters</w:t>
-      </w:r>
-      <w:r>
-        <w:rPr>
-          <w:rFonts w:ascii="Times New Roman" w:hAnsi="Times New Roman" w:cs="Times New Roman"/>
-          <w:bCs/>
-        </w:rPr>
-        <w:t xml:space="preserve"> </w:t>
-      </w:r>
-      <w:r>
-        <w:rPr>
-          <w:rFonts w:ascii="Times New Roman" w:hAnsi="Times New Roman" w:cs="Times New Roman"/>
-          <w:bCs/>
-        </w:rPr>
-        <w:t>for performance and energy efficiency. arXiv:2408.00741 (2024).</w:t>
-      </w:r>
-    </w:p>
-    <w:p>
-      <w:pPr>
-        <w:rPr>
-          <w:rFonts w:ascii="Times New Roman" w:hAnsi="Times New Roman" w:cs="Times New Roman"/>
-          <w:bCs/>
-        </w:rPr>
-      </w:pPr>
-      <w:r>
-        <w:rPr>
-          <w:rFonts w:ascii="Times New Roman" w:hAnsi="Times New Roman" w:cs="Times New Roman"/>
-          <w:bCs/>
-        </w:rPr>
-        <w:t>[10] Wang, Y. et al. BurstGPT: A real-world workload dataset for large</w:t>
-      </w:r>
-      <w:r>
-        <w:rPr>
-          <w:rFonts w:ascii="Times New Roman" w:hAnsi="Times New Roman" w:cs="Times New Roman"/>
-          <w:bCs/>
-        </w:rPr>
-        <w:t xml:space="preserve"> </w:t>
-      </w:r>
-      <w:r>
-        <w:rPr>
-          <w:rFonts w:ascii="Times New Roman" w:hAnsi="Times New Roman" w:cs="Times New Roman"/>
-          <w:bCs/>
-        </w:rPr>
-        <w:t>language models. arXiv (2024).</w:t>
+        <w:t xml:space="preserve">language models. </w:t>
+      </w:r>
+      <w:proofErr w:type="spellStart"/>
+      <w:r>
+        <w:rPr>
+          <w:rFonts w:ascii="Times New Roman" w:hAnsi="Times New Roman" w:cs="Times New Roman"/>
+          <w:bCs/>
+        </w:rPr>
+        <w:t>arXiv</w:t>
+      </w:r>
+      <w:proofErr w:type="spellEnd"/>
+      <w:r>
+        <w:rPr>
+          <w:rFonts w:ascii="Times New Roman" w:hAnsi="Times New Roman" w:cs="Times New Roman"/>
+          <w:bCs/>
+        </w:rPr>
+        <w:t xml:space="preserve"> (2024).</w:t>
       </w:r>
     </w:p>
     <w:p>
@@ -2856,7 +3238,6 @@
   <w:style w:type="character" w:default="1" w:styleId="DefaultParagraphFont">
     <w:name w:val="Default Paragraph Font"/>
     <w:uiPriority w:val="1"/>
-    <w:semiHidden/>
     <w:unhideWhenUsed/>
   </w:style>
   <w:style w:type="table" w:default="1" w:styleId="TableNormal">

</xml_diff>